<commit_message>
Temporarily disable form submissions
</commit_message>
<xml_diff>
--- a/public/legal/personal-data-processing-agreement.docx
+++ b/public/legal/personal-data-processing-agreement.docx
@@ -470,7 +470,7 @@
           <w:color w:val="5E5E5E"/>
           <w:lang w:eastAsia="ru-RU"/>
         </w:rPr>
-        <w:t xml:space="preserve"> направления Пользователем соответствующего распоряжения в простой письменной форме на адрес контактной электронной почты указанной на сайте itls.ai.</w:t>
+        <w:t xml:space="preserve"> направления Пользователем соответствующего распоряжения в простой письменной форме на адрес контактной электронной почты указанной на сайте цифровая-методология.рф или digital-methodology.ru.</w:t>
       </w:r>
       <w:r>
         <w:rPr>
@@ -551,7 +551,7 @@
           <w:color w:val="5E5E5E"/>
           <w:lang w:eastAsia="ru-RU"/>
         </w:rPr>
-        <w:t xml:space="preserve"> размещения, если иное не предусмотрено новой редакцией Соглашения. Ссылка на действующую редакцию всегда находится на страницах сайта: itls.ai</w:t>
+        <w:t xml:space="preserve"> размещения, если иное не предусмотрено новой редакцией Соглашения. Ссылка на действующую редакцию всегда находится на страницах сайта: цифровая-методология.рф или digital-methodology.ru</w:t>
       </w:r>
       <w:r>
         <w:rPr>

</xml_diff>